<commit_message>
sostituzione link get con post+token CSRF
</commit_message>
<xml_diff>
--- a/INFO/NerdVault_Use_Cases_Documentation_Coerente.docx
+++ b/INFO/NerdVault_Use_Cases_Documentation_Coerente.docx
@@ -98,6 +98,18 @@
           <w:lang w:val="it-IT"/>
         </w:rPr>
         <w:t>.</w:t>
+      </w:r>
+    </w:p>
+    <w:p>
+      <w:pPr/>
+      <w:r>
+        <w:t>Le operazioni che modificano dati vengono confermate tramite richiesta sicura e non tramite semplice URL.</w:t>
+      </w:r>
+    </w:p>
+    <w:p>
+      <w:pPr/>
+      <w:r>
+        <w:t>Tutte le operazioni che modificano lo stato del sistema sono gestite tramite metodo POST e protette con token CSRF per prevenire richieste non autorizzate da siti esterni.</w:t>
       </w:r>
     </w:p>
     <w:p>

</xml_diff>